<commit_message>
Parte principal está funcional. Ainda faltam possibilidades de alterar o plano de aula (grade), APS, Desafio, Intrumentos de Avaliação e Composição da Nota.
</commit_message>
<xml_diff>
--- a/templates/Modelo Plano de Aula e Ensino - Template.docx
+++ b/templates/Modelo Plano de Aula e Ensino - Template.docx
@@ -405,6 +405,22 @@
                   </w:pPr>
                   <w:r>
                     <w:rPr>
+                      <w:rtl w:val="0"/>
+                    </w:rPr>
+                  </w:r>
+                </w:p>
+                <w:p>
+                  <w:pPr>
+                    <w:ind w:right="105"/>
+                    <w:jc w:val="both"/>
+                    <w:rPr>
+                      <w:rFonts w:ascii="Montserrat" w:cs="Montserrat" w:eastAsia="Montserrat" w:hAnsi="Montserrat"/>
+                      <w:sz w:val="20"/>
+                      <w:szCs w:val="20"/>
+                    </w:rPr>
+                  </w:pPr>
+                  <w:r>
+                    <w:rPr>
                       <w:rFonts w:ascii="Montserrat" w:cs="Montserrat" w:eastAsia="Montserrat" w:hAnsi="Montserrat"/>
                       <w:b w:val="1"/>
                       <w:bCs w:val="1"/>
@@ -469,7 +485,7 @@
                       <w:szCs w:val="20"/>
                       <w:rtl w:val="0"/>
                     </w:rPr>
-                    <w:t xml:space="preserve">80 hora-relógio</w:t>
+                    <w:t xml:space="preserve">{{ch_total}} hora-relógio</w:t>
                   </w:r>
                   <w:r>
                     <w:rPr>
@@ -599,7 +615,7 @@
                       <w:szCs w:val="20"/>
                       <w:rtl w:val="0"/>
                     </w:rPr>
-                    <w:t xml:space="preserve">40 hora-relógio</w:t>
+                    <w:t xml:space="preserve">{{ch_teorica}} hora-relógio</w:t>
                   </w:r>
                   <w:r>
                     <w:rPr>
@@ -728,7 +744,7 @@
                       <w:szCs w:val="20"/>
                       <w:rtl w:val="0"/>
                     </w:rPr>
-                    <w:t xml:space="preserve">40 hora-relógio</w:t>
+                    <w:t xml:space="preserve">{{ch_pratica}} hora-relógio</w:t>
                   </w:r>
                   <w:r>
                     <w:rPr>
@@ -853,6 +869,15 @@
                   </w:pPr>
                   <w:r>
                     <w:rPr>
+                      <w:rFonts w:ascii="Montserrat" w:cs="Montserrat" w:eastAsia="Montserrat" w:hAnsi="Montserrat"/>
+                      <w:sz w:val="20"/>
+                      <w:szCs w:val="20"/>
+                      <w:rtl w:val="0"/>
+                    </w:rPr>
+                    <w:t xml:space="preserve">{{ch_extensao}} hora-relógio</w:t>
+                  </w:r>
+                  <w:r>
+                    <w:rPr>
                       <w:rtl w:val="0"/>
                     </w:rPr>
                   </w:r>
@@ -1111,8 +1136,14 @@
             </w:pPr>
             <w:r>
               <w:rPr>
-                <w:rtl w:val="0"/>
-              </w:rPr>
+                <w:rFonts w:ascii="Montserrat" w:cs="Montserrat" w:eastAsia="Montserrat" w:hAnsi="Montserrat"/>
+                <w:b w:val="1"/>
+                <w:bCs w:val="1"/>
+                <w:sz w:val="20"/>
+                <w:szCs w:val="20"/>
+                <w:rtl w:val="0"/>
+              </w:rPr>
+              <w:t xml:space="preserve">CONTEÚDOS FORMATIVOS:</w:t>
             </w:r>
           </w:p>
           <w:p>
@@ -1128,22 +1159,74 @@
             <w:r>
               <w:rPr>
                 <w:rFonts w:ascii="Montserrat" w:cs="Montserrat" w:eastAsia="Montserrat" w:hAnsi="Montserrat"/>
-                <w:b w:val="1"/>
-                <w:bCs w:val="1"/>
-                <w:sz w:val="20"/>
-                <w:szCs w:val="20"/>
-                <w:rtl w:val="0"/>
-              </w:rPr>
-              <w:t xml:space="preserve">CONTEÚDOS FORMATIVOS:</w:t>
-            </w:r>
-            <w:r>
-              <w:rPr>
-                <w:rFonts w:ascii="Montserrat" w:cs="Montserrat" w:eastAsia="Montserrat" w:hAnsi="Montserrat"/>
-                <w:sz w:val="20"/>
-                <w:szCs w:val="20"/>
-                <w:rtl w:val="0"/>
-              </w:rPr>
-              <w:t xml:space="preserve">   {{conteudos_formativos}}</w:t>
+                <w:sz w:val="20"/>
+                <w:szCs w:val="20"/>
+                <w:rtl w:val="0"/>
+              </w:rPr>
+              <w:t xml:space="preserve">{%p for item in conteudos_formativos %}</w:t>
+            </w:r>
+          </w:p>
+          <w:p>
+            <w:pPr>
+              <w:numPr>
+                <w:ilvl w:val="0"/>
+                <w:numId w:val="1"/>
+              </w:numPr>
+              <w:ind w:left="720" w:right="105" w:hanging="360"/>
+              <w:jc w:val="both"/>
+              <w:rPr>
+                <w:rFonts w:ascii="Montserrat" w:cs="Montserrat" w:eastAsia="Montserrat" w:hAnsi="Montserrat"/>
+                <w:sz w:val="20"/>
+                <w:szCs w:val="20"/>
+                <w:u w:val="none"/>
+              </w:rPr>
+            </w:pPr>
+            <w:r>
+              <w:rPr>
+                <w:rFonts w:ascii="Montserrat" w:cs="Montserrat" w:eastAsia="Montserrat" w:hAnsi="Montserrat"/>
+                <w:sz w:val="20"/>
+                <w:szCs w:val="20"/>
+                <w:rtl w:val="0"/>
+              </w:rPr>
+              <w:t xml:space="preserve">{{ item }}</w:t>
+            </w:r>
+          </w:p>
+          <w:p>
+            <w:pPr>
+              <w:ind w:left="294" w:right="105" w:firstLine="0"/>
+              <w:jc w:val="both"/>
+              <w:rPr>
+                <w:rFonts w:ascii="Montserrat" w:cs="Montserrat" w:eastAsia="Montserrat" w:hAnsi="Montserrat"/>
+                <w:sz w:val="20"/>
+                <w:szCs w:val="20"/>
+              </w:rPr>
+            </w:pPr>
+            <w:r>
+              <w:rPr>
+                <w:rFonts w:ascii="Montserrat" w:cs="Montserrat" w:eastAsia="Montserrat" w:hAnsi="Montserrat"/>
+                <w:sz w:val="20"/>
+                <w:szCs w:val="20"/>
+                <w:rtl w:val="0"/>
+              </w:rPr>
+              <w:t xml:space="preserve">{%p endfor %}</w:t>
+            </w:r>
+          </w:p>
+          <w:p>
+            <w:pPr>
+              <w:ind w:left="294" w:right="105" w:firstLine="0"/>
+              <w:jc w:val="both"/>
+              <w:rPr>
+                <w:rFonts w:ascii="Montserrat" w:cs="Montserrat" w:eastAsia="Montserrat" w:hAnsi="Montserrat"/>
+                <w:b w:val="1"/>
+                <w:bCs w:val="1"/>
+                <w:sz w:val="20"/>
+                <w:szCs w:val="20"/>
+              </w:rPr>
+            </w:pPr>
+            <w:r>
+              <w:rPr>
+                <w:rtl w:val="0"/>
+              </w:rPr>
             </w:r>
           </w:p>
           <w:p>
@@ -1180,29 +1263,136 @@
               <w:jc w:val="both"/>
               <w:rPr>
                 <w:rFonts w:ascii="Montserrat" w:cs="Montserrat" w:eastAsia="Montserrat" w:hAnsi="Montserrat"/>
-                <w:sz w:val="20"/>
-                <w:szCs w:val="20"/>
-              </w:rPr>
-            </w:pPr>
-            <w:r>
-              <w:rPr>
-                <w:rFonts w:ascii="Montserrat" w:cs="Montserrat" w:eastAsia="Montserrat" w:hAnsi="Montserrat"/>
-                <w:b w:val="1"/>
-                <w:bCs w:val="1"/>
-                <w:sz w:val="20"/>
-                <w:szCs w:val="20"/>
-                <w:rtl w:val="0"/>
-              </w:rPr>
-              <w:t xml:space="preserve">BIBLIOGRAFIA BÁSICA: </w:t>
-            </w:r>
-            <w:r>
-              <w:rPr>
-                <w:rFonts w:ascii="Montserrat" w:cs="Montserrat" w:eastAsia="Montserrat" w:hAnsi="Montserrat"/>
-                <w:sz w:val="20"/>
-                <w:szCs w:val="20"/>
-                <w:rtl w:val="0"/>
-              </w:rPr>
-              <w:t xml:space="preserve">{{bibliografia_basica}}</w:t>
+                <w:b w:val="1"/>
+                <w:bCs w:val="1"/>
+                <w:sz w:val="20"/>
+                <w:szCs w:val="20"/>
+              </w:rPr>
+            </w:pPr>
+            <w:r>
+              <w:rPr>
+                <w:rFonts w:ascii="Montserrat" w:cs="Montserrat" w:eastAsia="Montserrat" w:hAnsi="Montserrat"/>
+                <w:b w:val="1"/>
+                <w:bCs w:val="1"/>
+                <w:sz w:val="20"/>
+                <w:szCs w:val="20"/>
+                <w:rtl w:val="0"/>
+              </w:rPr>
+              <w:t xml:space="preserve">BIBLIOGRAFIA BÁSICA:</w:t>
+            </w:r>
+          </w:p>
+          <w:p>
+            <w:pPr>
+              <w:ind w:left="294" w:right="105" w:firstLine="0"/>
+              <w:jc w:val="both"/>
+              <w:rPr>
+                <w:rFonts w:ascii="Montserrat" w:cs="Montserrat" w:eastAsia="Montserrat" w:hAnsi="Montserrat"/>
+                <w:sz w:val="20"/>
+                <w:szCs w:val="20"/>
+              </w:rPr>
+            </w:pPr>
+            <w:r>
+              <w:rPr>
+                <w:rFonts w:ascii="Montserrat" w:cs="Montserrat" w:eastAsia="Montserrat" w:hAnsi="Montserrat"/>
+                <w:sz w:val="20"/>
+                <w:szCs w:val="20"/>
+                <w:rtl w:val="0"/>
+              </w:rPr>
+              <w:t xml:space="preserve">{%p for item in bibliografia_basica %}</w:t>
+            </w:r>
+          </w:p>
+          <w:p>
+            <w:pPr>
+              <w:ind w:left="294" w:right="105" w:firstLine="0"/>
+              <w:jc w:val="both"/>
+              <w:rPr>
+                <w:rFonts w:ascii="Montserrat" w:cs="Montserrat" w:eastAsia="Montserrat" w:hAnsi="Montserrat"/>
+                <w:sz w:val="20"/>
+                <w:szCs w:val="20"/>
+              </w:rPr>
+            </w:pPr>
+            <w:r>
+              <w:rPr>
+                <w:rFonts w:ascii="Montserrat" w:cs="Montserrat" w:eastAsia="Montserrat" w:hAnsi="Montserrat"/>
+                <w:sz w:val="20"/>
+                <w:szCs w:val="20"/>
+                <w:rtl w:val="0"/>
+              </w:rPr>
+              <w:t xml:space="preserve">{{ item.num }}{{ item.autor }}</w:t>
+            </w:r>
+            <w:r>
+              <w:rPr>
+                <w:rFonts w:ascii="Montserrat" w:cs="Montserrat" w:eastAsia="Montserrat" w:hAnsi="Montserrat"/>
+                <w:b w:val="1"/>
+                <w:bCs w:val="1"/>
+                <w:sz w:val="20"/>
+                <w:szCs w:val="20"/>
+                <w:rtl w:val="0"/>
+              </w:rPr>
+              <w:t xml:space="preserve">{{ item.titulo }}</w:t>
+            </w:r>
+            <w:r>
+              <w:rPr>
+                <w:rFonts w:ascii="Montserrat" w:cs="Montserrat" w:eastAsia="Montserrat" w:hAnsi="Montserrat"/>
+                <w:sz w:val="20"/>
+                <w:szCs w:val="20"/>
+                <w:rtl w:val="0"/>
+              </w:rPr>
+              <w:t xml:space="preserve">{{ item.resto }}</w:t>
+            </w:r>
+            <w:r>
+              <w:rPr>
+                <w:rFonts w:ascii="Montserrat" w:cs="Montserrat" w:eastAsia="Montserrat" w:hAnsi="Montserrat"/>
+                <w:color w:val="1155cc"/>
+                <w:sz w:val="20"/>
+                <w:szCs w:val="20"/>
+                <w:u w:val="single"/>
+                <w:rtl w:val="0"/>
+              </w:rPr>
+              <w:t xml:space="preserve">{{ item.url }}</w:t>
+            </w:r>
+            <w:r>
+              <w:rPr>
+                <w:rtl w:val="0"/>
+              </w:rPr>
+            </w:r>
+          </w:p>
+          <w:p>
+            <w:pPr>
+              <w:ind w:left="294" w:right="105" w:firstLine="0"/>
+              <w:jc w:val="both"/>
+              <w:rPr>
+                <w:rFonts w:ascii="Montserrat" w:cs="Montserrat" w:eastAsia="Montserrat" w:hAnsi="Montserrat"/>
+                <w:sz w:val="20"/>
+                <w:szCs w:val="20"/>
+              </w:rPr>
+            </w:pPr>
+            <w:r>
+              <w:rPr>
+                <w:rFonts w:ascii="Montserrat" w:cs="Montserrat" w:eastAsia="Montserrat" w:hAnsi="Montserrat"/>
+                <w:sz w:val="20"/>
+                <w:szCs w:val="20"/>
+                <w:rtl w:val="0"/>
+              </w:rPr>
+              <w:t xml:space="preserve">{%p endfor %}</w:t>
+            </w:r>
+          </w:p>
+          <w:p>
+            <w:pPr>
+              <w:ind w:left="294" w:right="105" w:firstLine="0"/>
+              <w:jc w:val="both"/>
+              <w:rPr>
+                <w:rFonts w:ascii="Montserrat" w:cs="Montserrat" w:eastAsia="Montserrat" w:hAnsi="Montserrat"/>
+                <w:b w:val="1"/>
+                <w:bCs w:val="1"/>
+                <w:sz w:val="20"/>
+                <w:szCs w:val="20"/>
+              </w:rPr>
+            </w:pPr>
+            <w:r>
+              <w:rPr>
+                <w:rtl w:val="0"/>
+              </w:rPr>
             </w:r>
           </w:p>
           <w:p>
@@ -1277,7 +1467,7 @@
                 <w:szCs w:val="20"/>
                 <w:rtl w:val="0"/>
               </w:rPr>
-              <w:t xml:space="preserve">BIBLIOGRAFIA COMPLEMENTAR: </w:t>
+              <w:t xml:space="preserve">BIBLIOGRAFIA COMPLEMENTAR:</w:t>
             </w:r>
           </w:p>
           <w:p>
@@ -1297,8 +1487,109 @@
                 <w:szCs w:val="20"/>
                 <w:rtl w:val="0"/>
               </w:rPr>
-              <w:t xml:space="preserve">{{bibliografia_complementar}}</w:t>
-            </w:r>
+              <w:t xml:space="preserve">{%p for item in bibliografia_complementar %}</w:t>
+            </w:r>
+          </w:p>
+          <w:p>
+            <w:pPr>
+              <w:ind w:left="294" w:right="105" w:firstLine="0"/>
+              <w:jc w:val="both"/>
+              <w:rPr>
+                <w:rFonts w:ascii="Montserrat" w:cs="Montserrat" w:eastAsia="Montserrat" w:hAnsi="Montserrat"/>
+                <w:sz w:val="20"/>
+                <w:szCs w:val="20"/>
+              </w:rPr>
+            </w:pPr>
+            <w:r>
+              <w:rPr>
+                <w:rFonts w:ascii="Montserrat" w:cs="Montserrat" w:eastAsia="Montserrat" w:hAnsi="Montserrat"/>
+                <w:sz w:val="20"/>
+                <w:szCs w:val="20"/>
+                <w:rtl w:val="0"/>
+              </w:rPr>
+              <w:t xml:space="preserve">{{ item.num }}{{ item.autor }}</w:t>
+            </w:r>
+            <w:r>
+              <w:rPr>
+                <w:rFonts w:ascii="Montserrat" w:cs="Montserrat" w:eastAsia="Montserrat" w:hAnsi="Montserrat"/>
+                <w:b w:val="1"/>
+                <w:bCs w:val="1"/>
+                <w:sz w:val="20"/>
+                <w:szCs w:val="20"/>
+                <w:rtl w:val="0"/>
+              </w:rPr>
+              <w:t xml:space="preserve">{{ item.titulo }}</w:t>
+            </w:r>
+            <w:r>
+              <w:rPr>
+                <w:rFonts w:ascii="Montserrat" w:cs="Montserrat" w:eastAsia="Montserrat" w:hAnsi="Montserrat"/>
+                <w:sz w:val="20"/>
+                <w:szCs w:val="20"/>
+                <w:rtl w:val="0"/>
+              </w:rPr>
+              <w:t xml:space="preserve">{{ item.resto }}</w:t>
+            </w:r>
+            <w:r>
+              <w:rPr>
+                <w:rFonts w:ascii="Montserrat" w:cs="Montserrat" w:eastAsia="Montserrat" w:hAnsi="Montserrat"/>
+                <w:color w:val="1155cc"/>
+                <w:sz w:val="20"/>
+                <w:szCs w:val="20"/>
+                <w:u w:val="single"/>
+                <w:rtl w:val="0"/>
+              </w:rPr>
+              <w:t xml:space="preserve">{{ item.url }}</w:t>
+            </w:r>
+            <w:r>
+              <w:rPr>
+                <w:rtl w:val="0"/>
+              </w:rPr>
+            </w:r>
+          </w:p>
+          <w:p>
+            <w:pPr>
+              <w:ind w:left="294" w:right="105" w:firstLine="0"/>
+              <w:jc w:val="both"/>
+              <w:rPr>
+                <w:rFonts w:ascii="Montserrat" w:cs="Montserrat" w:eastAsia="Montserrat" w:hAnsi="Montserrat"/>
+                <w:sz w:val="20"/>
+                <w:szCs w:val="20"/>
+              </w:rPr>
+            </w:pPr>
+            <w:r>
+              <w:rPr>
+                <w:rFonts w:ascii="Montserrat" w:cs="Montserrat" w:eastAsia="Montserrat" w:hAnsi="Montserrat"/>
+                <w:sz w:val="20"/>
+                <w:szCs w:val="20"/>
+                <w:rtl w:val="0"/>
+              </w:rPr>
+              <w:t xml:space="preserve">{%p endfor %}</w:t>
+            </w:r>
+          </w:p>
+          <w:p>
+            <w:pPr>
+              <w:keepNext w:val="0"/>
+              <w:keepLines w:val="0"/>
+              <w:widowControl w:val="0"/>
+              <w:pBdr>
+                <w:top w:space="0" w:sz="0" w:val="nil"/>
+                <w:left w:space="0" w:sz="0" w:val="nil"/>
+                <w:bottom w:space="0" w:sz="0" w:val="nil"/>
+                <w:right w:space="0" w:sz="0" w:val="nil"/>
+                <w:between w:space="0" w:sz="0" w:val="nil"/>
+              </w:pBdr>
+              <w:shd w:fill="auto" w:val="clear"/>
+              <w:spacing w:after="0" w:before="0" w:line="240" w:lineRule="auto"/>
+              <w:ind w:left="294" w:right="105" w:firstLine="0"/>
+              <w:jc w:val="both"/>
+              <w:rPr>
+                <w:rFonts w:ascii="Montserrat" w:cs="Montserrat" w:eastAsia="Montserrat" w:hAnsi="Montserrat"/>
+                <w:b w:val="1"/>
+                <w:bCs w:val="1"/>
+                <w:sz w:val="20"/>
+                <w:szCs w:val="20"/>
+              </w:rPr>
+            </w:pPr>
             <w:r>
               <w:rPr>
                 <w:rtl w:val="0"/>
@@ -1378,11 +1669,23 @@
                 <w:szCs w:val="20"/>
                 <w:rtl w:val="0"/>
               </w:rPr>
-              <w:t xml:space="preserve">COMPETÊNCIAS E HABILIDADES</w:t>
-            </w:r>
-          </w:p>
-          <w:p>
-            <w:pPr>
+              <w:t xml:space="preserve">COMPETÊNCIAS E HABILIDADES: </w:t>
+            </w:r>
+          </w:p>
+          <w:p>
+            <w:pPr>
+              <w:keepNext w:val="0"/>
+              <w:keepLines w:val="0"/>
+              <w:widowControl w:val="0"/>
+              <w:pBdr>
+                <w:top w:space="0" w:sz="0" w:val="nil"/>
+                <w:left w:space="0" w:sz="0" w:val="nil"/>
+                <w:bottom w:space="0" w:sz="0" w:val="nil"/>
+                <w:right w:space="0" w:sz="0" w:val="nil"/>
+                <w:between w:space="0" w:sz="0" w:val="nil"/>
+              </w:pBdr>
+              <w:shd w:fill="auto" w:val="clear"/>
+              <w:spacing w:after="0" w:before="0" w:line="240" w:lineRule="auto"/>
               <w:ind w:left="294" w:right="105" w:firstLine="0"/>
               <w:jc w:val="both"/>
               <w:rPr>
@@ -1398,7 +1701,203 @@
                 <w:szCs w:val="20"/>
                 <w:rtl w:val="0"/>
               </w:rPr>
-              <w:t xml:space="preserve">{{competencia_habilidades}}</w:t>
+              <w:t xml:space="preserve">{%p for item in competencia_habilidades %}</w:t>
+            </w:r>
+          </w:p>
+          <w:p>
+            <w:pPr>
+              <w:keepNext w:val="0"/>
+              <w:keepLines w:val="0"/>
+              <w:widowControl w:val="0"/>
+              <w:pBdr>
+                <w:top w:space="0" w:sz="0" w:val="nil"/>
+                <w:left w:space="0" w:sz="0" w:val="nil"/>
+                <w:bottom w:space="0" w:sz="0" w:val="nil"/>
+                <w:right w:space="0" w:sz="0" w:val="nil"/>
+                <w:between w:space="0" w:sz="0" w:val="nil"/>
+              </w:pBdr>
+              <w:shd w:fill="auto" w:val="clear"/>
+              <w:spacing w:after="0" w:before="0" w:line="240" w:lineRule="auto"/>
+              <w:ind w:left="294" w:right="105" w:firstLine="0"/>
+              <w:jc w:val="both"/>
+              <w:rPr>
+                <w:rFonts w:ascii="Montserrat" w:cs="Montserrat" w:eastAsia="Montserrat" w:hAnsi="Montserrat"/>
+                <w:sz w:val="20"/>
+                <w:szCs w:val="20"/>
+              </w:rPr>
+            </w:pPr>
+            <w:r>
+              <w:rPr>
+                <w:rFonts w:ascii="Montserrat" w:cs="Montserrat" w:eastAsia="Montserrat" w:hAnsi="Montserrat"/>
+                <w:sz w:val="20"/>
+                <w:szCs w:val="20"/>
+                <w:rtl w:val="0"/>
+              </w:rPr>
+              <w:t xml:space="preserve">{%p if item.tag.startswith('C') %}</w:t>
+            </w:r>
+          </w:p>
+          <w:p>
+            <w:pPr>
+              <w:keepNext w:val="0"/>
+              <w:keepLines w:val="0"/>
+              <w:widowControl w:val="0"/>
+              <w:pBdr>
+                <w:top w:space="0" w:sz="0" w:val="nil"/>
+                <w:left w:space="0" w:sz="0" w:val="nil"/>
+                <w:bottom w:space="0" w:sz="0" w:val="nil"/>
+                <w:right w:space="0" w:sz="0" w:val="nil"/>
+                <w:between w:space="0" w:sz="0" w:val="nil"/>
+              </w:pBdr>
+              <w:shd w:fill="auto" w:val="clear"/>
+              <w:spacing w:after="0" w:before="0" w:line="240" w:lineRule="auto"/>
+              <w:ind w:left="294" w:right="105" w:firstLine="0"/>
+              <w:jc w:val="both"/>
+              <w:rPr>
+                <w:rFonts w:ascii="Montserrat" w:cs="Montserrat" w:eastAsia="Montserrat" w:hAnsi="Montserrat"/>
+                <w:b w:val="1"/>
+                <w:bCs w:val="1"/>
+                <w:sz w:val="20"/>
+                <w:szCs w:val="20"/>
+              </w:rPr>
+            </w:pPr>
+            <w:r>
+              <w:rPr>
+                <w:rFonts w:ascii="Montserrat" w:cs="Montserrat" w:eastAsia="Montserrat" w:hAnsi="Montserrat"/>
+                <w:b w:val="1"/>
+                <w:bCs w:val="1"/>
+                <w:sz w:val="20"/>
+                <w:szCs w:val="20"/>
+                <w:rtl w:val="0"/>
+              </w:rPr>
+              <w:t xml:space="preserve">{{ item.tag }} {{ item.texto }}</w:t>
+            </w:r>
+          </w:p>
+          <w:p>
+            <w:pPr>
+              <w:keepNext w:val="0"/>
+              <w:keepLines w:val="0"/>
+              <w:widowControl w:val="0"/>
+              <w:pBdr>
+                <w:top w:space="0" w:sz="0" w:val="nil"/>
+                <w:left w:space="0" w:sz="0" w:val="nil"/>
+                <w:bottom w:space="0" w:sz="0" w:val="nil"/>
+                <w:right w:space="0" w:sz="0" w:val="nil"/>
+                <w:between w:space="0" w:sz="0" w:val="nil"/>
+              </w:pBdr>
+              <w:shd w:fill="auto" w:val="clear"/>
+              <w:spacing w:after="0" w:before="0" w:line="240" w:lineRule="auto"/>
+              <w:ind w:left="294" w:right="105" w:firstLine="0"/>
+              <w:jc w:val="both"/>
+              <w:rPr>
+                <w:rFonts w:ascii="Montserrat" w:cs="Montserrat" w:eastAsia="Montserrat" w:hAnsi="Montserrat"/>
+                <w:sz w:val="20"/>
+                <w:szCs w:val="20"/>
+              </w:rPr>
+            </w:pPr>
+            <w:r>
+              <w:rPr>
+                <w:rFonts w:ascii="Montserrat" w:cs="Montserrat" w:eastAsia="Montserrat" w:hAnsi="Montserrat"/>
+                <w:sz w:val="20"/>
+                <w:szCs w:val="20"/>
+                <w:rtl w:val="0"/>
+              </w:rPr>
+              <w:t xml:space="preserve">{%p else %}</w:t>
+            </w:r>
+          </w:p>
+          <w:p>
+            <w:pPr>
+              <w:keepNext w:val="0"/>
+              <w:keepLines w:val="0"/>
+              <w:widowControl w:val="0"/>
+              <w:pBdr>
+                <w:top w:space="0" w:sz="0" w:val="nil"/>
+                <w:left w:space="0" w:sz="0" w:val="nil"/>
+                <w:bottom w:space="0" w:sz="0" w:val="nil"/>
+                <w:right w:space="0" w:sz="0" w:val="nil"/>
+                <w:between w:space="0" w:sz="0" w:val="nil"/>
+              </w:pBdr>
+              <w:shd w:fill="auto" w:val="clear"/>
+              <w:spacing w:after="0" w:before="0" w:line="240" w:lineRule="auto"/>
+              <w:ind w:left="294" w:right="105" w:firstLine="0"/>
+              <w:jc w:val="both"/>
+              <w:rPr>
+                <w:rFonts w:ascii="Montserrat" w:cs="Montserrat" w:eastAsia="Montserrat" w:hAnsi="Montserrat"/>
+                <w:sz w:val="20"/>
+                <w:szCs w:val="20"/>
+              </w:rPr>
+            </w:pPr>
+            <w:r>
+              <w:rPr>
+                <w:rFonts w:ascii="Montserrat" w:cs="Montserrat" w:eastAsia="Montserrat" w:hAnsi="Montserrat"/>
+                <w:sz w:val="20"/>
+                <w:szCs w:val="20"/>
+                <w:rtl w:val="0"/>
+              </w:rPr>
+              <w:t xml:space="preserve">{{ item.tag }} {{ item.texto }}</w:t>
+            </w:r>
+          </w:p>
+          <w:p>
+            <w:pPr>
+              <w:keepNext w:val="0"/>
+              <w:keepLines w:val="0"/>
+              <w:widowControl w:val="0"/>
+              <w:pBdr>
+                <w:top w:space="0" w:sz="0" w:val="nil"/>
+                <w:left w:space="0" w:sz="0" w:val="nil"/>
+                <w:bottom w:space="0" w:sz="0" w:val="nil"/>
+                <w:right w:space="0" w:sz="0" w:val="nil"/>
+                <w:between w:space="0" w:sz="0" w:val="nil"/>
+              </w:pBdr>
+              <w:shd w:fill="auto" w:val="clear"/>
+              <w:spacing w:after="0" w:before="0" w:line="240" w:lineRule="auto"/>
+              <w:ind w:left="294" w:right="105" w:firstLine="0"/>
+              <w:jc w:val="both"/>
+              <w:rPr>
+                <w:rFonts w:ascii="Montserrat" w:cs="Montserrat" w:eastAsia="Montserrat" w:hAnsi="Montserrat"/>
+                <w:sz w:val="20"/>
+                <w:szCs w:val="20"/>
+              </w:rPr>
+            </w:pPr>
+            <w:r>
+              <w:rPr>
+                <w:rFonts w:ascii="Montserrat" w:cs="Montserrat" w:eastAsia="Montserrat" w:hAnsi="Montserrat"/>
+                <w:sz w:val="20"/>
+                <w:szCs w:val="20"/>
+                <w:rtl w:val="0"/>
+              </w:rPr>
+              <w:t xml:space="preserve">{%p endif %}</w:t>
+            </w:r>
+          </w:p>
+          <w:p>
+            <w:pPr>
+              <w:keepNext w:val="0"/>
+              <w:keepLines w:val="0"/>
+              <w:widowControl w:val="0"/>
+              <w:pBdr>
+                <w:top w:space="0" w:sz="0" w:val="nil"/>
+                <w:left w:space="0" w:sz="0" w:val="nil"/>
+                <w:bottom w:space="0" w:sz="0" w:val="nil"/>
+                <w:right w:space="0" w:sz="0" w:val="nil"/>
+                <w:between w:space="0" w:sz="0" w:val="nil"/>
+              </w:pBdr>
+              <w:shd w:fill="auto" w:val="clear"/>
+              <w:spacing w:after="0" w:before="0" w:line="240" w:lineRule="auto"/>
+              <w:ind w:left="294" w:right="105" w:firstLine="0"/>
+              <w:jc w:val="both"/>
+              <w:rPr>
+                <w:rFonts w:ascii="Montserrat" w:cs="Montserrat" w:eastAsia="Montserrat" w:hAnsi="Montserrat"/>
+                <w:sz w:val="20"/>
+                <w:szCs w:val="20"/>
+              </w:rPr>
+            </w:pPr>
+            <w:r>
+              <w:rPr>
+                <w:rFonts w:ascii="Montserrat" w:cs="Montserrat" w:eastAsia="Montserrat" w:hAnsi="Montserrat"/>
+                <w:sz w:val="20"/>
+                <w:szCs w:val="20"/>
+                <w:rtl w:val="0"/>
+              </w:rPr>
+              <w:t xml:space="preserve">{%p endfor %}</w:t>
             </w:r>
             <w:r>
               <w:rPr>
@@ -4823,40 +5322,11 @@
             <w:r>
               <w:rPr>
                 <w:rFonts w:ascii="Montserrat" w:cs="Montserrat" w:eastAsia="Montserrat" w:hAnsi="Montserrat"/>
-                <w:b w:val="0"/>
-                <w:bCs w:val="0"/>
-                <w:i w:val="0"/>
-                <w:iCs w:val="0"/>
-                <w:smallCaps w:val="0"/>
-                <w:strike w:val="0"/>
-                <w:color w:val="000000"/>
-                <w:sz w:val="20"/>
-                <w:szCs w:val="20"/>
-                <w:u w:val="none"/>
-                <w:shd w:fill="auto" w:val="clear"/>
-                <w:vertAlign w:val="baseline"/>
-                <w:rtl w:val="0"/>
-              </w:rPr>
-              <w:t xml:space="preserve">Projetar e implementar filtros digitais utilizando ferramentas computacionais para aplicações em alguma das seguintes áreas: áudio, eletrônica analógica, instrumentação eletrônica, robótica, sensoriamento. </w:t>
-            </w:r>
-            <w:r>
-              <w:rPr>
-                <w:rFonts w:ascii="Montserrat" w:cs="Montserrat" w:eastAsia="Montserrat" w:hAnsi="Montserrat"/>
-                <w:b w:val="0"/>
-                <w:bCs w:val="0"/>
-                <w:i w:val="0"/>
-                <w:iCs w:val="0"/>
-                <w:smallCaps w:val="0"/>
-                <w:strike w:val="0"/>
-                <w:color w:val="000000"/>
-                <w:sz w:val="20"/>
-                <w:szCs w:val="20"/>
-                <w:highlight w:val="yellow"/>
-                <w:u w:val="none"/>
-                <w:vertAlign w:val="baseline"/>
-                <w:rtl w:val="0"/>
-              </w:rPr>
-              <w:t xml:space="preserve">(exemplo dessa disciplina)</w:t>
+                <w:sz w:val="20"/>
+                <w:szCs w:val="20"/>
+                <w:rtl w:val="0"/>
+              </w:rPr>
+              <w:t xml:space="preserve">{{desafio}}</w:t>
             </w:r>
             <w:r>
               <w:rPr>
@@ -8759,7 +9229,121 @@
 </file>
 
 <file path=word/numbering.xml><?xml version="1.0" encoding="utf-8"?>
-<w:numbering xmlns:mc="http://schemas.openxmlformats.org/markup-compatibility/2006" xmlns:o="urn:schemas-microsoft-com:office:office" xmlns:r="http://schemas.openxmlformats.org/officeDocument/2006/relationships" xmlns:m="http://schemas.openxmlformats.org/officeDocument/2006/math" xmlns:v="urn:schemas-microsoft-com:vml" xmlns:wp="http://schemas.openxmlformats.org/drawingml/2006/wordprocessingDrawing" xmlns:w10="urn:schemas-microsoft-com:office:word" xmlns:w="http://schemas.openxmlformats.org/wordprocessingml/2006/main" xmlns:wne="http://schemas.microsoft.com/office/word/2006/wordml" xmlns:sl="http://schemas.openxmlformats.org/schemaLibrary/2006/main" xmlns:a="http://schemas.openxmlformats.org/drawingml/2006/main" xmlns:pic="http://schemas.openxmlformats.org/drawingml/2006/picture" xmlns:c="http://schemas.openxmlformats.org/drawingml/2006/chart" xmlns:lc="http://schemas.openxmlformats.org/drawingml/2006/lockedCanvas" xmlns:dgm="http://schemas.openxmlformats.org/drawingml/2006/diagram" xmlns:wps="http://schemas.microsoft.com/office/word/2010/wordprocessingShape" xmlns:wpg="http://schemas.microsoft.com/office/word/2010/wordprocessingGroup" xmlns:w14="http://schemas.microsoft.com/office/word/2010/wordml" xmlns:w15="http://schemas.microsoft.com/office/word/2012/wordml" xmlns:w16="http://schemas.microsoft.com/office/word/2018/wordml" xmlns:w16cex="http://schemas.microsoft.com/office/word/2018/wordml/cex" xmlns:w16cid="http://schemas.microsoft.com/office/word/2016/wordml/cid" xmlns="http://schemas.microsoft.com/office/tasks/2019/documenttasks" xmlns:cr="http://schemas.microsoft.com/office/comments/2020/reactions"/>
+<w:numbering xmlns:mc="http://schemas.openxmlformats.org/markup-compatibility/2006" xmlns:o="urn:schemas-microsoft-com:office:office" xmlns:r="http://schemas.openxmlformats.org/officeDocument/2006/relationships" xmlns:m="http://schemas.openxmlformats.org/officeDocument/2006/math" xmlns:v="urn:schemas-microsoft-com:vml" xmlns:wp="http://schemas.openxmlformats.org/drawingml/2006/wordprocessingDrawing" xmlns:w10="urn:schemas-microsoft-com:office:word" xmlns:w="http://schemas.openxmlformats.org/wordprocessingml/2006/main" xmlns:wne="http://schemas.microsoft.com/office/word/2006/wordml" xmlns:sl="http://schemas.openxmlformats.org/schemaLibrary/2006/main" xmlns:a="http://schemas.openxmlformats.org/drawingml/2006/main" xmlns:pic="http://schemas.openxmlformats.org/drawingml/2006/picture" xmlns:c="http://schemas.openxmlformats.org/drawingml/2006/chart" xmlns:lc="http://schemas.openxmlformats.org/drawingml/2006/lockedCanvas" xmlns:dgm="http://schemas.openxmlformats.org/drawingml/2006/diagram" xmlns:wps="http://schemas.microsoft.com/office/word/2010/wordprocessingShape" xmlns:wpg="http://schemas.microsoft.com/office/word/2010/wordprocessingGroup" xmlns:w14="http://schemas.microsoft.com/office/word/2010/wordml" xmlns:w15="http://schemas.microsoft.com/office/word/2012/wordml" xmlns:w16="http://schemas.microsoft.com/office/word/2018/wordml" xmlns:w16cex="http://schemas.microsoft.com/office/word/2018/wordml/cex" xmlns:w16cid="http://schemas.microsoft.com/office/word/2016/wordml/cid" xmlns="http://schemas.microsoft.com/office/tasks/2019/documenttasks" xmlns:cr="http://schemas.microsoft.com/office/comments/2020/reactions">
+  <w:abstractNum w:abstractNumId="1">
+    <w:lvl w:ilvl="0">
+      <w:start w:val="1"/>
+      <w:numFmt w:val="bullet"/>
+      <w:lvlText w:val="●"/>
+      <w:lvlJc w:val="left"/>
+      <w:pPr>
+        <w:ind w:left="720" w:hanging="360"/>
+      </w:pPr>
+      <w:rPr>
+        <w:u w:val="none"/>
+      </w:rPr>
+    </w:lvl>
+    <w:lvl w:ilvl="1">
+      <w:start w:val="1"/>
+      <w:numFmt w:val="bullet"/>
+      <w:lvlText w:val="○"/>
+      <w:lvlJc w:val="left"/>
+      <w:pPr>
+        <w:ind w:left="1440" w:hanging="360"/>
+      </w:pPr>
+      <w:rPr>
+        <w:u w:val="none"/>
+      </w:rPr>
+    </w:lvl>
+    <w:lvl w:ilvl="2">
+      <w:start w:val="1"/>
+      <w:numFmt w:val="bullet"/>
+      <w:lvlText w:val="■"/>
+      <w:lvlJc w:val="left"/>
+      <w:pPr>
+        <w:ind w:left="2160" w:hanging="360"/>
+      </w:pPr>
+      <w:rPr>
+        <w:u w:val="none"/>
+      </w:rPr>
+    </w:lvl>
+    <w:lvl w:ilvl="3">
+      <w:start w:val="1"/>
+      <w:numFmt w:val="bullet"/>
+      <w:lvlText w:val="●"/>
+      <w:lvlJc w:val="left"/>
+      <w:pPr>
+        <w:ind w:left="2880" w:hanging="360"/>
+      </w:pPr>
+      <w:rPr>
+        <w:u w:val="none"/>
+      </w:rPr>
+    </w:lvl>
+    <w:lvl w:ilvl="4">
+      <w:start w:val="1"/>
+      <w:numFmt w:val="bullet"/>
+      <w:lvlText w:val="○"/>
+      <w:lvlJc w:val="left"/>
+      <w:pPr>
+        <w:ind w:left="3600" w:hanging="360"/>
+      </w:pPr>
+      <w:rPr>
+        <w:u w:val="none"/>
+      </w:rPr>
+    </w:lvl>
+    <w:lvl w:ilvl="5">
+      <w:start w:val="1"/>
+      <w:numFmt w:val="bullet"/>
+      <w:lvlText w:val="■"/>
+      <w:lvlJc w:val="left"/>
+      <w:pPr>
+        <w:ind w:left="4320" w:hanging="360"/>
+      </w:pPr>
+      <w:rPr>
+        <w:u w:val="none"/>
+      </w:rPr>
+    </w:lvl>
+    <w:lvl w:ilvl="6">
+      <w:start w:val="1"/>
+      <w:numFmt w:val="bullet"/>
+      <w:lvlText w:val="●"/>
+      <w:lvlJc w:val="left"/>
+      <w:pPr>
+        <w:ind w:left="5040" w:hanging="360"/>
+      </w:pPr>
+      <w:rPr>
+        <w:u w:val="none"/>
+      </w:rPr>
+    </w:lvl>
+    <w:lvl w:ilvl="7">
+      <w:start w:val="1"/>
+      <w:numFmt w:val="bullet"/>
+      <w:lvlText w:val="○"/>
+      <w:lvlJc w:val="left"/>
+      <w:pPr>
+        <w:ind w:left="5760" w:hanging="360"/>
+      </w:pPr>
+      <w:rPr>
+        <w:u w:val="none"/>
+      </w:rPr>
+    </w:lvl>
+    <w:lvl w:ilvl="8">
+      <w:start w:val="1"/>
+      <w:numFmt w:val="bullet"/>
+      <w:lvlText w:val="■"/>
+      <w:lvlJc w:val="left"/>
+      <w:pPr>
+        <w:ind w:left="6480" w:hanging="360"/>
+      </w:pPr>
+      <w:rPr>
+        <w:u w:val="none"/>
+      </w:rPr>
+    </w:lvl>
+  </w:abstractNum>
+  <w:num w:numId="1">
+    <w:abstractNumId w:val="1"/>
+  </w:num>
+</w:numbering>
 </file>
 
 <file path=word/styles.xml><?xml version="1.0" encoding="utf-8"?>

</xml_diff>